<commit_message>
r30: 建议 N+1 预取（排位 slot×priority 分组+概率星期分桶，118→179 QPS +51%），行为等价 75/75+49/49+E2E 6/6；修 Server 残留 WAL 清理
</commit_message>
<xml_diff>
--- a/docs/thesis/毕业论文初稿.docx
+++ b/docs/thesis/毕业论文初稿.docx
@@ -3956,6 +3956,19 @@
           <w:sz w:val="24"/>
         </w:rPr>
         <w:t>在优化对比之外，另以混合负载实验考察写入密集场景的尾延迟与稳定性：6 个并发客户端在 20 秒内混发预约、取消、候补、审批、改期与读请求共 2,320 次，全程零请求错误、零 5xx（200/400/409 分别为 1,198/381/741，4xx 均为预期内的满员与冲突拒绝）；整体延迟 p50=14.5ms、p95=53.6ms、p99=91.8ms、最大 178.7ms。写前日志在实验窗口内由 0.12MB 增至 2.24MB，属写入集中期的正常表现，未见异常增长。该实验为本机回环环境的实测证据，脚本与报告见 scripts/mixed_load.py 与 docs/evidence/load/。</w:t>
+      </w:r>
+    </w:p>
+    <w:p>
+      <w:pPr>
+        <w:ind w:firstLine="480"/>
+      </w:pPr>
+      <w:r>
+        <w:rPr>
+          <w:rFonts w:ascii="宋体" w:hAnsi="宋体" w:eastAsia="宋体"/>
+          <w:b w:val="0"/>
+          <w:sz w:val="24"/>
+        </w:rPr>
+        <w:t>在端点层面另做一次 N+1 查询消除：约束感知建议端点最初对 7 天窗口内每场次分别执行排位与概率查询（每请求约数百条 SQL），改为按（场次×优先级）分组计数与按星期分桶的历史释放两条预取查询后，在 104 场次、40 场满员带候补的负载下吞吐由 118 提升至 179 次/秒（+51%），且行为等价性由建议与概率的既有断言（T69/T71）逐值验证。</w:t>
       </w:r>
     </w:p>
     <w:p>

</xml_diff>

<commit_message>
r33: 管理员强制完成/取消预约(force-complete/force-cancel+ADMIN 取消原因+迁移+T78)+公平审计 N+1 消除(6 条 GROUP BY 预聚合)；修第 13 例 _id valuedouble 缺陷与 T46 周界 flaky；79 集成+50 契约全绿
</commit_message>
<xml_diff>
--- a/docs/thesis/毕业论文初稿.docx
+++ b/docs/thesis/毕业论文初稿.docx
@@ -163,7 +163,7 @@
           <w:b w:val="0"/>
           <w:sz w:val="24"/>
         </w:rPr>
-        <w:t>系统通过五层自动化验证：24 个单元测试、78 项集成断言组（含 720 次并发争抢实验——实验样本内未出现超卖、30 次进程中断恢复全部正确、五组跨规则组合验证、凭据生命周期与约束感知建议评估）、50 个端点的契约测试与灰盒/文档测试、模糊稳健性与浸泡稳定性实验，以及持续集成三通道门禁（构建与测试、静态分析、AddressSanitizer 内存安全）。计时旁路实验表明登录路径对有效与无效账号的响应时间比仅为 1.07，账号枚举的可观测时间差被显著压平。连接复用与语句缓存优化使读路径吞吐提升最高 541%（约 6.4 倍），p50 延迟下降 87%。</w:t>
+        <w:t>系统通过五层自动化验证：24 个单元测试、79 项集成断言组（含 720 次并发争抢实验——实验样本内未出现超卖、30 次进程中断恢复全部正确、五组跨规则组合验证、凭据生命周期与约束感知建议评估）、50 个端点的契约测试与灰盒/文档测试、模糊稳健性与浸泡稳定性实验，以及持续集成三通道门禁（构建与测试、静态分析、AddressSanitizer 内存安全）。计时旁路实验表明登录路径对有效与无效账号的响应时间比仅为 1.07，账号枚举的可观测时间差被显著压平。连接复用与语句缓存优化使读路径吞吐提升最高 541%（约 6.4 倍），p50 延迟下降 87%。</w:t>
       </w:r>
     </w:p>
     <w:p>
@@ -459,7 +459,7 @@
           <w:b w:val="0"/>
           <w:sz w:val="24"/>
         </w:rPr>
-        <w:t>（4）构建了五层自动化验证体系：单元测试 24 个、集成断言组 78 项（T01–T77 与 CLI 检查，含 720 次并发争抢、30 次故障注入恢复、五组跨规则组合验证、凭据生命周期与约束感知建议评估）、50 个端点的契约测试与灰盒/文档测试、模糊与浸泡实验，并以持续集成三通道门禁（构建与测试、静态分析、AddressSanitizer 内存安全）保障每一次提交；</w:t>
+        <w:t>（4）构建了五层自动化验证体系：单元测试 24 个、集成断言组 79 项（T01–T78 与 CLI 检查，含 720 次并发争抢、30 次故障注入恢复、五组跨规则组合验证、凭据生命周期与约束感知建议评估）、50 个端点的契约测试与灰盒/文档测试、模糊与浸泡实验，并以持续集成三通道门禁（构建与测试、静态分析、AddressSanitizer 内存安全）保障每一次提交；</w:t>
       </w:r>
     </w:p>
     <w:p>
@@ -1970,7 +1970,7 @@
           <w:b w:val="0"/>
           <w:sz w:val="24"/>
         </w:rPr>
-        <w:t>测试体系分五层：（1）Unity 单元测试 24 个，不经 HTTP 直接链接业务层与数据层；（2）集成实验 70 项断言组（编号 T01–T77 另加 CLI 数据库检查，以测试运行器 record() 调用数为准），以独立 Python 客户端驱动真实服务进程，覆盖功能、安全、并发、故障恢复、运营能力与跨规则组合语义；（3）契约测试（50 个端点逐项校验响应封套与字段类型）与灰盒/文档一致性测试；（4）模糊稳健性实验与浸泡稳定性实验；（5）真实浏览器端到端验收。所有实验使用独立临时端口与全新数据库副本，原始证据（数据库、日志、结果 JSON）完整归档，失败样本不销毁。</w:t>
+        <w:t>测试体系分五层：（1）Unity 单元测试 24 个，不经 HTTP 直接链接业务层与数据层；（2）集成实验 70 项断言组（编号 T01–T78 另加 CLI 数据库检查，以测试运行器 record() 调用数为准），以独立 Python 客户端驱动真实服务进程，覆盖功能、安全、并发、故障恢复、运营能力与跨规则组合语义；（3）契约测试（50 个端点逐项校验响应封套与字段类型）与灰盒/文档一致性测试；（4）模糊稳健性实验与浸泡稳定性实验；（5）真实浏览器端到端验收。所有实验使用独立临时端口与全新数据库副本，原始证据（数据库、日志、结果 JSON）完整归档，失败样本不销毁。</w:t>
       </w:r>
     </w:p>
     <w:p>
@@ -4738,7 +4738,7 @@
           <w:b w:val="0"/>
           <w:sz w:val="24"/>
         </w:rPr>
-        <w:t>本课题面向高校开放实验室管理场景，完整经历了需求分析、架构设计、编码实现、自动化验证与性能优化五个阶段，交付了一个功能完备、可靠性经过实测论证的 C 语言 Web 系统（v1.14.0，schema v5、17 张数据表、48 个契约端点、78 项集成断言组）。主要成果包括：容量制预约与候补补位的业务闭环，延伸至限时签到、场次提醒、爽约信用、时间重叠检测的完整运营规则，并深化出预约审批流、可执行 FIFO 与限时保留（HELD）的候补策略、优先级抢占与信用账户、资源维护工单/时段窗/资格授权等一体化机制；以单写者事务与持久化回执为核心的并发一致性与幂等设计；面向真实管理的独立控制台与自动备份、历史归档等运营能力；覆盖单元、集成、契约、并发、故障注入、模糊与浸泡的五层自动化验证体系，以及构建、静态分析与 AddressSanitizer 三通道持续集成门禁；从 720 次争抢实验、30 次崩溃恢复实验、跨规则组合验证、计时旁路实验到性能优化对比的完整实测证据链。</w:t>
+        <w:t>本课题面向高校开放实验室管理场景，完整经历了需求分析、架构设计、编码实现、自动化验证与性能优化五个阶段，交付了一个功能完备、可靠性经过实测论证的 C 语言 Web 系统（v1.14.0，schema v5、17 张数据表、48 个契约端点、79 项集成断言组）。主要成果包括：容量制预约与候补补位的业务闭环，延伸至限时签到、场次提醒、爽约信用、时间重叠检测的完整运营规则，并深化出预约审批流、可执行 FIFO 与限时保留（HELD）的候补策略、优先级抢占与信用账户、资源维护工单/时段窗/资格授权等一体化机制；以单写者事务与持久化回执为核心的并发一致性与幂等设计；面向真实管理的独立控制台与自动备份、历史归档等运营能力；覆盖单元、集成、契约、并发、故障注入、模糊与浸泡的五层自动化验证体系，以及构建、静态分析与 AddressSanitizer 三通道持续集成门禁；从 720 次争抢实验、30 次崩溃恢复实验、跨规则组合验证、计时旁路实验到性能优化对比的完整实测证据链。</w:t>
       </w:r>
     </w:p>
     <w:p>

</xml_diff>

<commit_message>
thesis+docs: 论文补全 v1.17.0 内容与 README 文档表扩展
论文（依据 git 记录与近期工作补全六处）：
- 4.1 总体架构：业务层补五模块划分（booking/asset/stats/token/service）；安全边界三头→五头双通道下发
- 5.1 环境与构建：LOC 修正（1,600→3,300 行 C、260→800+850 前端、3,400→7,200 测试）+ 模块拆分方法学（行多重集审计证明零语义改动）+ --notify-file 参数
- 5.4 前端段：补 v1.17.0 七轮体验打磨（View Transitions/毛玻璃/等宽数字/移动端/倒计时确认/SMIL）+ 页面体积 60KB→180KB 实测
- 5.7 新增 outbox 通知派发段（渠道函数指针表/同事务快照/失败记账重试/业务与外发解耦 + 独立单元用例）
- 6.9 调试记录新增第（11）例：realloc 失败路径原块泄漏 CWE-401（静态分析发现、运行时测试不可达的低频路径）
- 英文摘要补 outbox dispatch channel；大纲同步十一例

README：自研代码量修正 6,600→3,300（修正 wc 双重计数）；前端行数拆分脚本+样式；
文档表新增论文初稿/答辩演示/竞品分析/优化蓝图四行；底部 42 轮迭代→116 次提交·16 版本（git 实测）。

验证：doc 门禁 7/7（README 14 个本地引用完整）；docx 重生成。
</commit_message>
<xml_diff>
--- a/docs/thesis/毕业论文初稿.docx
+++ b/docs/thesis/毕业论文初稿.docx
@@ -225,7 +225,7 @@
           <w:b w:val="0"/>
           <w:sz w:val="24"/>
         </w:rPr>
-        <w:t>The system guarantees concurrent correctness with single-writer transactions (BEGIN IMMEDIATE) plus a per-slot capacity invariant (occupied capacity counts CONFIRMED and HELD); achieves idempotency through persisted request receipts; and completes no-show reclamation and promotion inside one transaction in a server-side sweeper. Beyond the core loop it provides an approval workflow for reservations, an executable-FIFO waitlist strategy with time-limited HELD holds, priority-based preemption with credit compensation, asset maintenance work orders with availability windows and qualification grants, self-managed API access tokens, a standalone admin console (slot adjustment, user management, announcements and runtime logs), time-windowed check-in, session start reminders, automatic backup rotation, a no-show credit constraint, time-overlap detection, and hardened browser attack surface via global security headers.</w:t>
+        <w:t>The system guarantees concurrent correctness with single-writer transactions (BEGIN IMMEDIATE) plus a per-slot capacity invariant (occupied capacity counts CONFIRMED and HELD); achieves idempotency through persisted request receipts; and completes no-show reclamation and promotion inside one transaction in a server-side sweeper. Beyond the core loop it provides an approval workflow for reservations, an executable-FIFO waitlist strategy with time-limited HELD holds, priority-based preemption with credit compensation, asset maintenance work orders with availability windows and qualification grants, self-managed API access tokens, an outbox-based reliable notification dispatch channel, a standalone admin console (slot adjustment, user management, announcements and runtime logs), time-windowed check-in, session start reminders, automatic backup rotation, a no-show credit constraint, time-overlap detection, and hardened browser attack surface via global security headers.</w:t>
       </w:r>
     </w:p>
     <w:p>
@@ -667,7 +667,7 @@
           <w:b w:val="0"/>
           <w:sz w:val="24"/>
         </w:rPr>
-        <w:t>前端采用无框架的原生 HTML/CSS/JavaScript 单页实现（v1.16.0 引入共用基座 ui.js 与深色主题 theme.js），与嵌入式后端在依赖哲学上保持一致：全部资源本地静态服务，无构建步骤、无第三方运行时，页面总量不足 60 KB。</w:t>
+        <w:t>前端采用无框架的原生 HTML/CSS/JavaScript 单页实现（v1.16.0 引入共用基座 ui.js 与深色主题 theme.js），与嵌入式后端在依赖哲学上保持一致：全部资源本地静态服务，无构建步骤、无第三方运行时，页面总量约 180 KB（含样式表与图标）。v1.17.0 又以七轮迭代完成体验打磨：主题切换升级为 View Transitions 圆形扩散过渡（特性检测降级为瞬时切换）；顶栏吸附式毛玻璃、表单聚焦联动、表格与角标等宽数字（消除数字跳动）等信息层级优化；移动端适配（窄屏页签条吸顶、输入框 16px 防 iOS 聚焦缩放、触摸目标加高、全面屏安全区）；危险操作的 3 秒倒计时二次确认；以及 favicon 的 SMIL 冒泡动画。全部视觉效果经设计令牌统一管理，并在 prefers-reduced-motion 与打印介质下整体关停，保证无障碍与可用性优先。</w:t>
       </w:r>
     </w:p>
     <w:p>
@@ -1076,7 +1076,7 @@
           <w:b w:val="0"/>
           <w:sz w:val="24"/>
         </w:rPr>
-        <w:t>系统采用五层架构，如图 4-1 所示：浏览器层负责交互；接入层由 CivetWeb 提供 HTTP 解析与多线程调度，并完成会话认证与请求伪造防护；业务层以单写者事务组织全部写路径；数据访问层封装参数绑定、语句缓存、连接复用与 schema 迁移；存储层为启用 WAL 的 SQLite。横切模块包括限流防爆破、运行指标与结构化日志。</w:t>
+        <w:t>系统采用五层架构，如图 4-1 所示：浏览器层负责交互；接入层由 CivetWeb 提供 HTTP 解析与多线程调度，并完成会话认证与请求伪造防护；业务层以单写者事务组织全部写路径，并按域划分为五个模块——预约与候补（booking）、资源与维护（asset）、统计与导出（stats）、令牌与信用（token）及平台域（service，覆盖通知、会话、用户、后台扫描与审计），各模块经内部共享头协作；数据访问层封装参数绑定、语句缓存、连接复用与 schema 迁移；存储层为启用 WAL 的 SQLite。横切模块包括限流防爆破、运行指标与结构化日志。</w:t>
       </w:r>
     </w:p>
     <w:p>
@@ -1140,7 +1140,7 @@
           <w:b w:val="0"/>
           <w:sz w:val="24"/>
         </w:rPr>
-        <w:t>安全边界方面，服务仅监听 127.0.0.1 回环地址，供本机浏览器访问；全部响应携带统一安全响应头（X-Frame-Options: DENY、Content-Security-Policy: default-src 'self'、Referrer-Policy: no-referrer）；请求体上限 16 KB 且拒绝重复键。</w:t>
+        <w:t>安全边界方面，服务仅监听 127.0.0.1 回环地址，供本机浏览器访问；全部响应携带五条统一安全响应头（Content-Security-Policy: default-src 'self'、X-Content-Type-Options: nosniff、X-Frame-Options: DENY、Referrer-Policy: no-referrer、Permissions-Policy: camera/microphone/geolocation 禁用——静态页经服务器全局配置、API 与指标响应经处理器内共享常量双通道下发，二者内容一致）；请求体上限 16 KB 且拒绝重复键。</w:t>
       </w:r>
     </w:p>
     <w:p>
@@ -1661,7 +1661,20 @@
           <w:b w:val="0"/>
           <w:sz w:val="24"/>
         </w:rPr>
-        <w:t>开发环境为 Windows x64 + MinGW-w64 GCC 15.2，核心代码约 1,600 行 C（不含第三方库）与 260 行前端脚本，自动化测试约 3,400 行。构建脚本支持四个目标：正式版（自动运行 25 个单元测试）、TEST_FAULTS 测试版（内置三类故障注入点：提交前崩溃 86、提交后响应前崩溃 87、扫描事务中途崩溃 88）、加固版（FORTIFY、栈保护与自动变量零初始化）与覆盖率版（--coverage，配合优雅停机信号 SIGBREAK 刷写 gcov 数据）。命令行支持提醒窗口（--remind-sec）、备份间隔（--backup-interval）与演示数据（--demo-days）等运行参数，全部参数均有边界校验。</w:t>
+        <w:t>开发环境为 Windows x64 + MinGW-w64 GCC 15.2，自研核心代码约 3,300 行 C（不含第三方库），前端约 800 行脚本与 850 行样式表，自动化测试约 7,200 行。业务代码按域组织为 booking/asset/stats/token/service 五个模块（另有 http/db/util/ratelimit/metrics/log 六个基础模块）——v1.17.0 将早期单体的 service.c 按域拆分而来：函数体逐行移动，以“行多重集审计”（拆分前后全部代码行的多重集比对）证明除六个跨模块助手去 static 外零语义改动，并以构建、覆盖率与前端·文档门禁的源码读取点同步更新保障工具链不漂移。</w:t>
+      </w:r>
+    </w:p>
+    <w:p>
+      <w:pPr>
+        <w:ind w:firstLine="480"/>
+      </w:pPr>
+      <w:r>
+        <w:rPr>
+          <w:rFonts w:ascii="宋体" w:hAnsi="宋体" w:eastAsia="宋体"/>
+          <w:b w:val="0"/>
+          <w:sz w:val="24"/>
+        </w:rPr>
+        <w:t>构建脚本支持四个目标：正式版（自动运行 25 个单元测试）、TEST_FAULTS 测试版（内置三类故障注入点：提交前崩溃 86、提交后响应前崩溃 87、扫描事务中途崩溃 88）、加固版（FORTIFY、栈保护与自动变量零初始化）与覆盖率版（--coverage，配合优雅停机信号 SIGBREAK 刷写 gcov 数据）。命令行支持提醒窗口（--remind-sec）、备份间隔（--backup-interval）、通知外发文件（--notify-file）与演示数据（--demo-days）等运行参数，全部参数均有边界校验。</w:t>
       </w:r>
     </w:p>
     <w:p>
@@ -1941,6 +1954,19 @@
           <w:sz w:val="24"/>
         </w:rPr>
         <w:t>个人与全体记录支持 page/page_size/has_more 分页与状态筛选；统计按北京日聚合七项计数，CSV 导出带 BOM 与合计行以兼容 Excel 直接打开；前端以上一轮请求编号持久化（sessionStorage）实现跨刷新的重试提示，全部状态变更按钮在确认结果前保持锁定，取消等不可逆操作采用两段式页内确认，避免重复提交与误操作。</w:t>
+      </w:r>
+    </w:p>
+    <w:p>
+      <w:pPr>
+        <w:ind w:firstLine="480"/>
+      </w:pPr>
+      <w:r>
+        <w:rPr>
+          <w:rFonts w:ascii="宋体" w:hAnsi="宋体" w:eastAsia="宋体"/>
+          <w:b w:val="0"/>
+          <w:sz w:val="24"/>
+        </w:rPr>
+        <w:t>通知外发采用 outbox 模式保障可靠性：notify() 首先落站内收件箱（行为与既有通知完全一致），当启用 --notify-file 时业务事务内同写一条 outbox 快照；后台扫描线程在自动提交模式下按渠道派发（渠道以函数指针表组织，内置 JSONL 追加的文件渠道），失败仅记 attempts 与 last_error 供下轮重试，派发错误绝不回传到业务事务。该设计把“业务成功”与“外发成功”解耦：即使外发目标不可写，预约/补位等业务结果与站内通知也不受影响，恢复后自动补发。渠道派发含独立单元用例（关闭零行为、同事务登记、目标不可写失败记账、恢复后补发成功）。</w:t>
       </w:r>
     </w:p>
     <w:p>
@@ -4731,7 +4757,7 @@
     </w:p>
     <w:p>
       <w:pPr>
-        <w:ind w:firstLine="480"/>
+        <w:ind w:left="420"/>
       </w:pPr>
       <w:r>
         <w:rPr>
@@ -4739,7 +4765,20 @@
           <w:b w:val="0"/>
           <w:sz w:val="24"/>
         </w:rPr>
-        <w:t>上述缺陷均由自动化测试或浏览器验收先行暴露，修复后以新增回归用例固化，验证了“测试驱动发现—最小复现—修复—回归固化”流程的有效性。</w:t>
+        <w:t>（11）realloc 失败路径的原块泄漏（CWE-401）：Prometheus 指标文本构造函数在缓冲区扩容处直接以原指针接收 realloc 返回值——当扩容失败返回 NULL 时原缓冲区指针被覆盖、内存泄漏且调用方无法感知。该缺陷从未被任何运行时测试暴露（扩容失败仅在内存耗尽路径触发），由 gcc -fanalyzer 静态分析通道确定性报出，修复为临时指针接收、失败时先释放原块再返回。这印证了静态分析门禁与运行时测试的互补性：低频故障路径的成本必须由工具链而非运气兜底，也说明“realloc 结果必须经临时指针接收”应作为 C 项目的编码规约。</w:t>
+      </w:r>
+    </w:p>
+    <w:p>
+      <w:pPr>
+        <w:ind w:firstLine="480"/>
+      </w:pPr>
+      <w:r>
+        <w:rPr>
+          <w:rFonts w:ascii="宋体" w:hAnsi="宋体" w:eastAsia="宋体"/>
+          <w:b w:val="0"/>
+          <w:sz w:val="24"/>
+        </w:rPr>
+        <w:t>上述缺陷均由自动化测试或静态分析先行暴露，修复后以新增回归用例或编码规约固化，验证了“测试驱动发现—最小复现—修复—回归固化”流程的有效性。</w:t>
       </w:r>
     </w:p>
     <w:p>

</xml_diff>